<commit_message>
feat: five more requirement forms go macroized
Clearance, Certification, Student Intern Feedback, Training Supervisor
Feedback, and the Performance Appraisal now merge per intern from
starters in templates/cas/ — intern name (with honorific where the form
uses Mr.), course, year level, college, host office and address,
supervisor (with honorific from their staff profile), coordinator,
target hours, training dates, and the internship term replace the
hardcoded sample values the user marked in red. The Board-Approved
Companies List is now the blank-copy example in tests. 331 tests
passing.
</commit_message>
<xml_diff>
--- a/public/documents/templates/cas/endorsement-letter-template.docx
+++ b/public/documents/templates/cas/endorsement-letter-template.docx
@@ -253,7 +253,6 @@
       <w:r>
         <w:rPr>
           <w:rFonts w:ascii="Arial" w:hAnsi="Arial" w:cs="Arial"/>
-          <w:color w:val="FF0000"/>
           <w:sz w:val="24"/>
           <w:szCs w:val="24"/>
         </w:rPr>
@@ -262,35 +261,6 @@
       <w:r>
         <w:rPr>
           <w:rFonts w:ascii="Arial" w:hAnsi="Arial" w:cs="Arial"/>
-          <w:color w:val="FF0000"/>
-          <w:sz w:val="24"/>
-          <w:szCs w:val="24"/>
-          <w:vertAlign w:val="superscript"/>
-        </w:rPr>
-        <w:t/>
-      </w:r>
-      <w:r>
-        <w:rPr>
-          <w:rFonts w:ascii="Arial" w:hAnsi="Arial" w:cs="Arial"/>
-          <w:color w:val="FF0000"/>
-          <w:sz w:val="24"/>
-          <w:szCs w:val="24"/>
-        </w:rPr>
-        <w:t xml:space="preserve"/>
-      </w:r>
-      <w:r>
-        <w:rPr>
-          <w:rFonts w:ascii="Arial" w:hAnsi="Arial" w:cs="Arial"/>
-          <w:color w:val="FF0000"/>
-          <w:sz w:val="24"/>
-          <w:szCs w:val="24"/>
-        </w:rPr>
-        <w:t xml:space="preserve"/>
-      </w:r>
-      <w:r>
-        <w:rPr>
-          <w:rFonts w:ascii="Arial" w:hAnsi="Arial" w:cs="Arial"/>
-          <w:color w:val="FF0000"/>
           <w:sz w:val="24"/>
           <w:szCs w:val="24"/>
         </w:rPr>
@@ -339,7 +309,6 @@
       <w:r>
         <w:rPr>
           <w:rFonts w:ascii="Arial" w:hAnsi="Arial" w:cs="Arial"/>
-          <w:color w:val="FF0000"/>
           <w:sz w:val="24"/>
           <w:szCs w:val="24"/>
         </w:rPr>
@@ -348,42 +317,14 @@
       <w:r>
         <w:rPr>
           <w:rFonts w:ascii="Arial" w:hAnsi="Arial" w:cs="Arial"/>
-          <w:color w:val="FF0000"/>
-          <w:sz w:val="24"/>
-          <w:szCs w:val="24"/>
-        </w:rPr>
-        <w:t xml:space="preserve"/>
-      </w:r>
-      <w:r>
-        <w:rPr>
-          <w:rFonts w:ascii="Arial" w:hAnsi="Arial" w:cs="Arial"/>
-          <w:color w:val="FF0000"/>
-          <w:sz w:val="24"/>
-          <w:szCs w:val="24"/>
-        </w:rPr>
-        <w:t/>
-      </w:r>
-      <w:r>
-        <w:rPr>
-          <w:rFonts w:ascii="Arial" w:hAnsi="Arial" w:cs="Arial"/>
-          <w:color w:val="FF0000"/>
-          <w:sz w:val="24"/>
-          <w:szCs w:val="24"/>
-        </w:rPr>
-        <w:t xml:space="preserve"> </w:t>
-      </w:r>
-      <w:r>
-        <w:rPr>
-          <w:rFonts w:ascii="Arial" w:hAnsi="Arial" w:cs="Arial"/>
-          <w:sz w:val="24"/>
-          <w:szCs w:val="24"/>
-        </w:rPr>
-        <w:t xml:space="preserve">student at the </w:t>
-      </w:r>
-      <w:r>
-        <w:rPr>
-          <w:rFonts w:ascii="Arial" w:hAnsi="Arial" w:cs="Arial"/>
-          <w:color w:val="FF0000"/>
+          <w:sz w:val="24"/>
+          <w:szCs w:val="24"/>
+        </w:rPr>
+        <w:t xml:space="preserve"> student at the </w:t>
+      </w:r>
+      <w:r>
+        <w:rPr>
+          <w:rFonts w:ascii="Arial" w:hAnsi="Arial" w:cs="Arial"/>
           <w:sz w:val="24"/>
           <w:szCs w:val="24"/>
         </w:rPr>
@@ -393,7 +334,6 @@
       <w:r>
         <w:rPr>
           <w:rFonts w:ascii="Arial" w:hAnsi="Arial" w:cs="Arial"/>
-          <w:color w:val="FF0000"/>
           <w:sz w:val="24"/>
           <w:szCs w:val="24"/>
         </w:rPr>
@@ -403,7 +343,6 @@
       <w:r>
         <w:rPr>
           <w:rFonts w:ascii="Arial" w:hAnsi="Arial" w:cs="Arial"/>
-          <w:color w:val="FF0000"/>
           <w:sz w:val="24"/>
           <w:szCs w:val="24"/>
         </w:rPr>
@@ -433,42 +372,7 @@
           <w:sz w:val="24"/>
           <w:szCs w:val="24"/>
         </w:rPr>
-        <w:t xml:space="preserve">The requested training of ${target_hours} hours</w:t>
-      </w:r>
-      <w:r>
-        <w:rPr>
-          <w:rFonts w:ascii="Arial" w:hAnsi="Arial" w:cs="Arial"/>
-          <w:color w:val="FF0000"/>
-          <w:sz w:val="24"/>
-          <w:szCs w:val="24"/>
-        </w:rPr>
-        <w:t/>
-      </w:r>
-      <w:r>
-        <w:rPr>
-          <w:rFonts w:ascii="Arial" w:hAnsi="Arial" w:cs="Arial"/>
-          <w:color w:val="FF0000"/>
-          <w:sz w:val="24"/>
-          <w:szCs w:val="24"/>
-        </w:rPr>
-        <w:t xml:space="preserve"/>
-      </w:r>
-      <w:r>
-        <w:rPr>
-          <w:rFonts w:ascii="Arial" w:hAnsi="Arial" w:cs="Arial"/>
-          <w:color w:val="FF0000"/>
-          <w:sz w:val="24"/>
-          <w:szCs w:val="24"/>
-        </w:rPr>
-        <w:t/>
-      </w:r>
-      <w:r>
-        <w:rPr>
-          <w:rFonts w:ascii="Arial" w:hAnsi="Arial" w:cs="Arial"/>
-          <w:sz w:val="24"/>
-          <w:szCs w:val="24"/>
-        </w:rPr>
-        <w:t xml:space="preserve"> includes exposure to the authentic business environment, observance of safety practices, and familiarization with the job/skills related to </w:t>
+        <w:t xml:space="preserve">The requested training of ${target_hours} hours includes exposure to the authentic business environment, observance of safety practices, and familiarization with the job/skills related to </w:t>
       </w:r>
       <w:r>
         <w:rPr>
@@ -626,7 +530,6 @@
           <w:rFonts w:ascii="Arial" w:hAnsi="Arial" w:cs="Arial"/>
           <w:b/>
           <w:bCs/>
-          <w:color w:val="FF0000"/>
           <w:sz w:val="24"/>
           <w:szCs w:val="24"/>
         </w:rPr>
@@ -636,7 +539,6 @@
           <w:rFonts w:ascii="Arial" w:hAnsi="Arial" w:cs="Arial"/>
           <w:b/>
           <w:bCs/>
-          <w:color w:val="FF0000"/>
           <w:sz w:val="24"/>
           <w:szCs w:val="24"/>
         </w:rPr>
@@ -659,15 +561,7 @@
           <w:sz w:val="24"/>
           <w:szCs w:val="24"/>
         </w:rPr>
-        <w:t>Internship</w:t>
-      </w:r>
-      <w:r>
-        <w:rPr>
-          <w:rFonts w:ascii="Arial" w:hAnsi="Arial" w:cs="Arial"/>
-          <w:sz w:val="24"/>
-          <w:szCs w:val="24"/>
-        </w:rPr>
-        <w:t xml:space="preserve"> Coordinator</w:t>
+        <w:t>Internship Coordinator</w:t>
       </w:r>
     </w:p>
     <w:p>
@@ -734,7 +628,6 @@
           <w:rFonts w:ascii="Arial" w:hAnsi="Arial" w:cs="Arial"/>
           <w:b/>
           <w:bCs/>
-          <w:color w:val="FF0000"/>
           <w:sz w:val="24"/>
           <w:szCs w:val="24"/>
         </w:rPr>
@@ -744,7 +637,6 @@
           <w:rFonts w:ascii="Arial" w:hAnsi="Arial" w:cs="Arial"/>
           <w:b/>
           <w:bCs/>
-          <w:color w:val="FF0000"/>
           <w:sz w:val="24"/>
           <w:szCs w:val="24"/>
         </w:rPr>
@@ -757,15 +649,13 @@
         <w:jc w:val="both"/>
         <w:rPr>
           <w:rFonts w:ascii="Arial" w:hAnsi="Arial" w:cs="Arial"/>
-          <w:color w:val="FF0000"/>
-          <w:sz w:val="24"/>
-          <w:szCs w:val="24"/>
-        </w:rPr>
-      </w:pPr>
-      <w:r>
-        <w:rPr>
-          <w:rFonts w:ascii="Arial" w:hAnsi="Arial" w:cs="Arial"/>
-          <w:color w:val="FF0000"/>
+          <w:sz w:val="24"/>
+          <w:szCs w:val="24"/>
+        </w:rPr>
+      </w:pPr>
+      <w:r>
+        <w:rPr>
+          <w:rFonts w:ascii="Arial" w:hAnsi="Arial" w:cs="Arial"/>
           <w:sz w:val="24"/>
           <w:szCs w:val="24"/>
         </w:rPr>
@@ -774,7 +664,6 @@
       <w:r>
         <w:rPr>
           <w:rFonts w:ascii="Arial" w:hAnsi="Arial" w:cs="Arial"/>
-          <w:color w:val="FF0000"/>
           <w:sz w:val="24"/>
           <w:szCs w:val="24"/>
         </w:rPr>

</xml_diff>

<commit_message>
feat: campus_name setting, ordinal year level, gender-aware endorsement
Adds ojt_settings.campus_name (Settings field) — the certification
establishment line merges ${campus_name} instead of the hardcoded campus
text. The Performance Appraisal keeps its compact numeral style via
${year_level_ordinal} (1st-4th). The Endorsement Letter opens its
description with ${intern_honorific} is... instead of the hardcoded
"He is", matching the Mr./Ms. honorifics. 332 tests passing.
</commit_message>
<xml_diff>
--- a/public/documents/templates/cas/endorsement-letter-template.docx
+++ b/public/documents/templates/cas/endorsement-letter-template.docx
@@ -296,15 +296,15 @@
           <w:sz w:val="24"/>
           <w:szCs w:val="24"/>
         </w:rPr>
-        <w:t>H</w:t>
-      </w:r>
-      <w:r>
-        <w:rPr>
-          <w:rFonts w:ascii="Arial" w:hAnsi="Arial" w:cs="Arial"/>
-          <w:sz w:val="24"/>
-          <w:szCs w:val="24"/>
-        </w:rPr>
-        <w:t xml:space="preserve">e is a </w:t>
+        <w:t>${intern_honorific} is a</w:t>
+      </w:r>
+      <w:r>
+        <w:rPr>
+          <w:rFonts w:ascii="Arial" w:hAnsi="Arial" w:cs="Arial"/>
+          <w:sz w:val="24"/>
+          <w:szCs w:val="24"/>
+        </w:rPr>
+        <w:t xml:space="preserve"> </w:t>
       </w:r>
       <w:r>
         <w:rPr>

</xml_diff>